<commit_message>
Fix lab due day in Weekly Flow; refresh generated outputs
- Weekly Flow (both courses): Lab Results (20 pts) is due Friday,
  alongside Findings and Conclusions, rather than Wednesday
- Rebuilt the PDFs, Word docs, and accessible Word docs from the
  current Markdown (the accessible docs predate the Oct 3 companion
  guide links and the lab-due change)
- LAST_UPDATED set to October 7, 2026

Co-Authored-By: Claude Sonnet 5.5 <noreply@anthropic.com>
</commit_message>
<xml_diff>
--- a/downloads/CHEM121_Syllabus_Fall2026_Accessible.docx
+++ b/downloads/CHEM121_Syllabus_Fall2026_Accessible.docx
@@ -1675,7 +1675,7 @@
               <w:rPr>
                 <w:lang w:val="en-US"/>
               </w:rPr>
-              <w:t xml:space="preserve">3-2-1 Team post + upload due; OOL discussion post due; Lab Results (20 pts) due</w:t>
+              <w:t xml:space="preserve">3-2-1 Team post + upload due; OOL discussion post due</w:t>
             </w:r>
           </w:p>
         </w:tc>
@@ -1741,7 +1741,7 @@
               <w:rPr>
                 <w:lang w:val="en-US"/>
               </w:rPr>
-              <w:t xml:space="preserve">OOL replies due; Lab Findings (10 pts) and Conclusions (20 pts) due</w:t>
+              <w:t xml:space="preserve">OOL replies due; Lab Results (20 pts), Findings (10 pts), and Conclusions (20 pts) due</w:t>
             </w:r>
           </w:p>
         </w:tc>
@@ -6344,7 +6344,7 @@
       </w:r>
     </w:p>
     <w:bookmarkEnd w:id="75"/>
-    <w:bookmarkStart w:id="86" w:name="whats-covered"/>
+    <w:bookmarkStart w:id="89" w:name="whats-covered"/>
     <w:p>
       <w:pPr>
         <w:pStyle w:val="Heading1"/>
@@ -6549,7 +6549,7 @@
       </w:r>
     </w:p>
     <w:bookmarkEnd w:id="76"/>
-    <w:bookmarkStart w:id="77" w:name="week-2-ionic-and-covalent-bonding"/>
+    <w:bookmarkStart w:id="79" w:name="week-2-ionic-and-covalent-bonding"/>
     <w:p>
       <w:pPr>
         <w:pStyle w:val="Heading2"/>
@@ -6651,6 +6651,57 @@
     </w:p>
     <w:p>
       <w:pPr>
+        <w:pStyle w:val="Compact"/>
+        <w:numPr>
+          <w:ilvl w:val="0"/>
+          <w:numId w:val="1015"/>
+        </w:numPr>
+      </w:pPr>
+      <w:r>
+        <w:rPr>
+          <w:lang w:val="en-US"/>
+        </w:rPr>
+        <w:t xml:space="preserve">Structure guide:</w:t>
+      </w:r>
+      <w:r>
+        <w:rPr>
+          <w:lang w:val="en-US"/>
+        </w:rPr>
+        <w:t xml:space="preserve"> </w:t>
+      </w:r>
+      <w:hyperlink r:id="rId77">
+        <w:r>
+          <w:rPr>
+            <w:rStyle w:val="Hyperlink"/>
+            <w:lang w:val="en-US"/>
+          </w:rPr>
+          <w:t xml:space="preserve">Naming Compounds</w:t>
+        </w:r>
+      </w:hyperlink>
+      <w:r>
+        <w:rPr>
+          <w:lang w:val="en-US"/>
+        </w:rPr>
+        <w:t xml:space="preserve">,</w:t>
+      </w:r>
+      <w:r>
+        <w:rPr>
+          <w:lang w:val="en-US"/>
+        </w:rPr>
+        <w:t xml:space="preserve"> </w:t>
+      </w:r>
+      <w:hyperlink r:id="rId78">
+        <w:r>
+          <w:rPr>
+            <w:rStyle w:val="Hyperlink"/>
+            <w:lang w:val="en-US"/>
+          </w:rPr>
+          <w:t xml:space="preserve">Lewis Structures</w:t>
+        </w:r>
+      </w:hyperlink>
+    </w:p>
+    <w:p>
+      <w:pPr>
         <w:pStyle w:val="Heading3"/>
       </w:pPr>
       <w:r>
@@ -6720,8 +6771,8 @@
         <w:t xml:space="preserve">Also this week: Unit Quiz 1 (Ch. 1 + Ch. 2, no dimensional analysis); Writing Workshop 1</w:t>
       </w:r>
     </w:p>
-    <w:bookmarkEnd w:id="77"/>
-    <w:bookmarkStart w:id="78" w:name="X1fa0c109252ecd77242b8a57ffecfdec3cba0e8"/>
+    <w:bookmarkEnd w:id="79"/>
+    <w:bookmarkStart w:id="81" w:name="X1fa0c109252ecd77242b8a57ffecfdec3cba0e8"/>
     <w:p>
       <w:pPr>
         <w:pStyle w:val="Heading2"/>
@@ -6823,6 +6874,36 @@
     </w:p>
     <w:p>
       <w:pPr>
+        <w:pStyle w:val="Compact"/>
+        <w:numPr>
+          <w:ilvl w:val="0"/>
+          <w:numId w:val="1017"/>
+        </w:numPr>
+      </w:pPr>
+      <w:r>
+        <w:rPr>
+          <w:lang w:val="en-US"/>
+        </w:rPr>
+        <w:t xml:space="preserve">Structure guide:</w:t>
+      </w:r>
+      <w:r>
+        <w:rPr>
+          <w:lang w:val="en-US"/>
+        </w:rPr>
+        <w:t xml:space="preserve"> </w:t>
+      </w:r>
+      <w:hyperlink r:id="rId80">
+        <w:r>
+          <w:rPr>
+            <w:rStyle w:val="Hyperlink"/>
+            <w:lang w:val="en-US"/>
+          </w:rPr>
+          <w:t xml:space="preserve">Shape, Polarity, and Intermolecular Forces</w:t>
+        </w:r>
+      </w:hyperlink>
+    </w:p>
+    <w:p>
+      <w:pPr>
         <w:pStyle w:val="Heading3"/>
       </w:pPr>
       <w:r>
@@ -6877,8 +6958,8 @@
         <w:t xml:space="preserve">Lab 3 (continued into simulations alongside Writing Workshop 2)</w:t>
       </w:r>
     </w:p>
-    <w:bookmarkEnd w:id="78"/>
-    <w:bookmarkStart w:id="79" w:name="week-4-heat-phase-changes-and-the-mole"/>
+    <w:bookmarkEnd w:id="81"/>
+    <w:bookmarkStart w:id="82" w:name="week-4-heat-phase-changes-and-the-mole"/>
     <w:p>
       <w:pPr>
         <w:pStyle w:val="Heading2"/>
@@ -7046,8 +7127,8 @@
         <w:t xml:space="preserve">Lab 4 (continued — weighing copper — alongside Library Visit 1)</w:t>
       </w:r>
     </w:p>
-    <w:bookmarkEnd w:id="79"/>
-    <w:bookmarkStart w:id="80" w:name="week-5-stoichiometry-and-reaction-energy"/>
+    <w:bookmarkEnd w:id="82"/>
+    <w:bookmarkStart w:id="83" w:name="week-5-stoichiometry-and-reaction-energy"/>
     <w:p>
       <w:pPr>
         <w:pStyle w:val="Heading2"/>
@@ -7215,8 +7296,8 @@
         <w:t xml:space="preserve">Also this week: Unit Quiz 2 (Ch. 3 + Ch. 4)</w:t>
       </w:r>
     </w:p>
-    <w:bookmarkEnd w:id="80"/>
-    <w:bookmarkStart w:id="81" w:name="X5d22eb4502b18aa74b67ea44c18b9375ee6515b"/>
+    <w:bookmarkEnd w:id="83"/>
+    <w:bookmarkStart w:id="84" w:name="X5d22eb4502b18aa74b67ea44c18b9375ee6515b"/>
     <w:p>
       <w:pPr>
         <w:pStyle w:val="Heading2"/>
@@ -7384,8 +7465,8 @@
         <w:t xml:space="preserve">Day 2 alongside Library Visit 2)</w:t>
       </w:r>
     </w:p>
-    <w:bookmarkEnd w:id="81"/>
-    <w:bookmarkStart w:id="82" w:name="week-7-gas-laws-and-air-quality"/>
+    <w:bookmarkEnd w:id="84"/>
+    <w:bookmarkStart w:id="85" w:name="week-7-gas-laws-and-air-quality"/>
     <w:p>
       <w:pPr>
         <w:pStyle w:val="Heading2"/>
@@ -7565,8 +7646,8 @@
         <w:t xml:space="preserve">Also this week: Unit Quiz 3 (Ch. 5)</w:t>
       </w:r>
     </w:p>
-    <w:bookmarkEnd w:id="82"/>
-    <w:bookmarkStart w:id="83" w:name="week-8-concentration-acids-and-bases"/>
+    <w:bookmarkEnd w:id="85"/>
+    <w:bookmarkStart w:id="86" w:name="week-8-concentration-acids-and-bases"/>
     <w:p>
       <w:pPr>
         <w:pStyle w:val="Heading2"/>
@@ -7740,8 +7821,8 @@
         <w:t xml:space="preserve">Calendar note: 11/11 campus holiday — lecture and lab still held this week</w:t>
       </w:r>
     </w:p>
-    <w:bookmarkEnd w:id="83"/>
-    <w:bookmarkStart w:id="84" w:name="week-9-ph-poh-and-buffers"/>
+    <w:bookmarkEnd w:id="86"/>
+    <w:bookmarkStart w:id="87" w:name="week-9-ph-poh-and-buffers"/>
     <w:p>
       <w:pPr>
         <w:pStyle w:val="Heading2"/>
@@ -7897,8 +7978,8 @@
         <w:t xml:space="preserve">Also this week: Unit Quiz 4 (Ch. 6 + Ch. 7)</w:t>
       </w:r>
     </w:p>
-    <w:bookmarkEnd w:id="84"/>
-    <w:bookmarkStart w:id="85" w:name="Xca6fbe98ab29572cfd9dea230a62f761715b6c1"/>
+    <w:bookmarkEnd w:id="87"/>
+    <w:bookmarkStart w:id="88" w:name="Xca6fbe98ab29572cfd9dea230a62f761715b6c1"/>
     <w:p>
       <w:pPr>
         <w:pStyle w:val="Heading2"/>
@@ -8126,8 +8207,8 @@
         <w:t xml:space="preserve">Calendar note: campus closed 11/25–11/26 during this content window</w:t>
       </w:r>
     </w:p>
-    <w:bookmarkEnd w:id="85"/>
-    <w:bookmarkEnd w:id="86"/>
+    <w:bookmarkEnd w:id="88"/>
+    <w:bookmarkEnd w:id="89"/>
     <w:sectPr xmlns:r="http://schemas.openxmlformats.org/officeDocument/2006/relationships">
       <w:footerReference r:id="rIdFtr1" w:type="default"/>
       <w:pgSz w:h="15840" w:w="12240"/>

</xml_diff>

<commit_message>
CHEM121 What's Covered: drop Wednesday/Sunday labels from activities
The new weekly routine has one 3-2-1 post covering both Activities
(due Thursday), so "Wednesday activity" / "Sunday activity" no longer
described when anything is due. All 20 activities now read
"Activity: A##". Rebuilt PDFs, site data, and accessible Word doc.

Co-Authored-By: Claude Sonnet 5.5 <noreply@anthropic.com>
</commit_message>
<xml_diff>
--- a/downloads/CHEM121_Syllabus_Fall2026_Accessible.docx
+++ b/downloads/CHEM121_Syllabus_Fall2026_Accessible.docx
@@ -6772,7 +6772,7 @@
         <w:rPr>
           <w:lang w:val="en-US"/>
         </w:rPr>
-        <w:t xml:space="preserve">Wednesday activity: A01 (2.1–2.3)</w:t>
+        <w:t xml:space="preserve">Activity: A01 (2.1–2.3)</w:t>
       </w:r>
     </w:p>
     <w:p>
@@ -6787,7 +6787,7 @@
         <w:rPr>
           <w:lang w:val="en-US"/>
         </w:rPr>
-        <w:t xml:space="preserve">Sunday activity: A02 (2.4–2.8)</w:t>
+        <w:t xml:space="preserve">Activity: A02 (2.4–2.8)</w:t>
       </w:r>
     </w:p>
     <w:p>
@@ -6980,7 +6980,7 @@
         <w:rPr>
           <w:lang w:val="en-US"/>
         </w:rPr>
-        <w:t xml:space="preserve">Wednesday activity: A03 (3.1–3.6)</w:t>
+        <w:t xml:space="preserve">Activity: A03 (3.1–3.6)</w:t>
       </w:r>
     </w:p>
     <w:p>
@@ -6995,7 +6995,7 @@
         <w:rPr>
           <w:lang w:val="en-US"/>
         </w:rPr>
-        <w:t xml:space="preserve">Sunday activity: A04 (3.7–3.9)</w:t>
+        <w:t xml:space="preserve">Activity: A04 (3.7–3.9)</w:t>
       </w:r>
     </w:p>
     <w:p>
@@ -7182,7 +7182,7 @@
         <w:rPr>
           <w:lang w:val="en-US"/>
         </w:rPr>
-        <w:t xml:space="preserve">Wednesday activity: A05 (3.10–3.12)</w:t>
+        <w:t xml:space="preserve">Activity: A05 (3.10–3.12)</w:t>
       </w:r>
     </w:p>
     <w:p>
@@ -7197,7 +7197,7 @@
         <w:rPr>
           <w:lang w:val="en-US"/>
         </w:rPr>
-        <w:t xml:space="preserve">Sunday activity: A06 (4.1–4.4)</w:t>
+        <w:t xml:space="preserve">Activity: A06 (4.1–4.4)</w:t>
       </w:r>
     </w:p>
     <w:p>
@@ -7351,7 +7351,7 @@
         <w:rPr>
           <w:lang w:val="en-US"/>
         </w:rPr>
-        <w:t xml:space="preserve">Wednesday activity: A07 (4.5–4.7)</w:t>
+        <w:t xml:space="preserve">Activity: A07 (4.5–4.7)</w:t>
       </w:r>
     </w:p>
     <w:p>
@@ -7366,7 +7366,7 @@
         <w:rPr>
           <w:lang w:val="en-US"/>
         </w:rPr>
-        <w:t xml:space="preserve">Sunday activity: A08 (5.1–5.4)</w:t>
+        <w:t xml:space="preserve">Activity: A08 (5.1–5.4)</w:t>
       </w:r>
     </w:p>
     <w:p>
@@ -7505,7 +7505,7 @@
         <w:rPr>
           <w:lang w:val="en-US"/>
         </w:rPr>
-        <w:t xml:space="preserve">Wednesday activity: A09 (5.5–5.8)</w:t>
+        <w:t xml:space="preserve">Activity: A09 (5.5–5.8)</w:t>
       </w:r>
     </w:p>
     <w:p>
@@ -7520,7 +7520,7 @@
         <w:rPr>
           <w:lang w:val="en-US"/>
         </w:rPr>
-        <w:t xml:space="preserve">Sunday activity: A10 (5.9–5.10)</w:t>
+        <w:t xml:space="preserve">Activity: A10 (5.9–5.10)</w:t>
       </w:r>
     </w:p>
     <w:p>
@@ -7677,7 +7677,7 @@
         <w:rPr>
           <w:lang w:val="en-US"/>
         </w:rPr>
-        <w:t xml:space="preserve">Wednesday activity: A11 (5.11–5.12)</w:t>
+        <w:t xml:space="preserve">Activity: A11 (5.11–5.12)</w:t>
       </w:r>
     </w:p>
     <w:p>
@@ -7692,7 +7692,7 @@
         <w:rPr>
           <w:lang w:val="en-US"/>
         </w:rPr>
-        <w:t xml:space="preserve">Sunday activity: A12 (6.1–6.4)</w:t>
+        <w:t xml:space="preserve">Activity: A12 (6.1–6.4)</w:t>
       </w:r>
     </w:p>
     <w:p>
@@ -7843,7 +7843,7 @@
         <w:rPr>
           <w:lang w:val="en-US"/>
         </w:rPr>
-        <w:t xml:space="preserve">Wednesday activity: A13 (6.5–6.9)</w:t>
+        <w:t xml:space="preserve">Activity: A13 (6.5–6.9)</w:t>
       </w:r>
     </w:p>
     <w:p>
@@ -7858,7 +7858,7 @@
         <w:rPr>
           <w:lang w:val="en-US"/>
         </w:rPr>
-        <w:t xml:space="preserve">Sunday activity: A14 (7.1–7.4)</w:t>
+        <w:t xml:space="preserve">Activity: A14 (7.1–7.4)</w:t>
       </w:r>
     </w:p>
     <w:p>
@@ -8012,7 +8012,7 @@
         <w:rPr>
           <w:lang w:val="en-US"/>
         </w:rPr>
-        <w:t xml:space="preserve">Wednesday activity: A15 (7.5–7.8)</w:t>
+        <w:t xml:space="preserve">Activity: A15 (7.5–7.8)</w:t>
       </w:r>
     </w:p>
     <w:p>
@@ -8027,7 +8027,7 @@
         <w:rPr>
           <w:lang w:val="en-US"/>
         </w:rPr>
-        <w:t xml:space="preserve">Sunday activity: A16 (8.1–8.3)</w:t>
+        <w:t xml:space="preserve">Activity: A16 (8.1–8.3)</w:t>
       </w:r>
     </w:p>
     <w:p>
@@ -8187,7 +8187,7 @@
         <w:rPr>
           <w:lang w:val="en-US"/>
         </w:rPr>
-        <w:t xml:space="preserve">Wednesday activity: A17 (8.4–8.6)</w:t>
+        <w:t xml:space="preserve">Activity: A17 (8.4–8.6)</w:t>
       </w:r>
     </w:p>
     <w:p>
@@ -8202,7 +8202,7 @@
         <w:rPr>
           <w:lang w:val="en-US"/>
         </w:rPr>
-        <w:t xml:space="preserve">Sunday activity: A18 (8.8–8.9)</w:t>
+        <w:t xml:space="preserve">Activity: A18 (8.8–8.9)</w:t>
       </w:r>
     </w:p>
     <w:p>

</xml_diff>